<commit_message>
fix: restricción de fechas a 4 dígitos y rango válido, y diseño responsive para móviles
</commit_message>
<xml_diff>
--- a/Historias_de_Usuario_PayControl.docx
+++ b/Historias_de_Usuario_PayControl.docx
@@ -11,8 +11,6 @@
           <w:lang w:val="es-419"/>
         </w:rPr>
       </w:pPr>
-      <w:bookmarkStart w:id="0" w:name="_GoBack"/>
-      <w:bookmarkEnd w:id="0"/>
       <w:r>
         <w:rPr>
           <w:rFonts w:ascii="Arial" w:hAnsi="Arial" w:cs="Arial"/>
@@ -8613,6 +8611,66 @@
       <w:pPr>
         <w:spacing w:before="240" w:after="240"/>
         <w:jc w:val="both"/>
+      </w:pPr>
+      <w:r>
+        <w:t xml:space="preserve">Link al </w:t>
+      </w:r>
+      <w:proofErr w:type="spellStart"/>
+      <w:r>
+        <w:t>Github</w:t>
+      </w:r>
+      <w:proofErr w:type="spellEnd"/>
+      <w:r>
+        <w:t xml:space="preserve">: </w:t>
+      </w:r>
+      <w:hyperlink r:id="rId7" w:history="1">
+        <w:r>
+          <w:rPr>
+            <w:rStyle w:val="Hipervnculo"/>
+          </w:rPr>
+          <w:t>https://github.com/QuemantoCoronel/Sistema-de-pagos-Asistente-y-Gerente</w:t>
+        </w:r>
+      </w:hyperlink>
+    </w:p>
+    <w:p>
+      <w:pPr>
+        <w:spacing w:before="240" w:after="240"/>
+        <w:jc w:val="both"/>
+        <w:rPr>
+          <w:lang w:val="es-419"/>
+        </w:rPr>
+      </w:pPr>
+      <w:r>
+        <w:rPr>
+          <w:lang w:val="es-419"/>
+        </w:rPr>
+        <w:t>Link a la página</w:t>
+      </w:r>
+      <w:bookmarkStart w:id="0" w:name="_GoBack"/>
+      <w:bookmarkEnd w:id="0"/>
+      <w:r>
+        <w:rPr>
+          <w:lang w:val="es-419"/>
+        </w:rPr>
+        <w:t xml:space="preserve">: </w:t>
+      </w:r>
+      <w:hyperlink r:id="rId8" w:history="1">
+        <w:r>
+          <w:rPr>
+            <w:rStyle w:val="Hipervnculo"/>
+            <w:lang w:val="es-419"/>
+          </w:rPr>
+          <w:t>https://paycontrol-empresa.onrender.com</w:t>
+        </w:r>
+      </w:hyperlink>
+    </w:p>
+    <w:p>
+      <w:pPr>
+        <w:spacing w:before="240" w:after="240"/>
+        <w:jc w:val="both"/>
+        <w:rPr>
+          <w:lang w:val="es-419"/>
+        </w:rPr>
       </w:pPr>
     </w:p>
     <w:sectPr>
@@ -20224,6 +20282,17 @@
     <w:basedOn w:val="Fuentedeprrafopredeter"/>
     <w:rsid w:val="0037718A"/>
   </w:style>
+  <w:style w:type="character" w:styleId="Hipervnculo">
+    <w:name w:val="Hyperlink"/>
+    <w:basedOn w:val="Fuentedeprrafopredeter"/>
+    <w:uiPriority w:val="99"/>
+    <w:unhideWhenUsed/>
+    <w:rsid w:val="00FA4518"/>
+    <w:rPr>
+      <w:color w:val="0000FF" w:themeColor="hyperlink"/>
+      <w:u w:val="single"/>
+    </w:rPr>
+  </w:style>
 </w:styles>
 </file>
 
@@ -20552,7 +20621,7 @@
 </file>
 
 <file path=customXml/itemProps1.xml><?xml version="1.0" encoding="utf-8"?>
-<ds:datastoreItem xmlns:ds="http://schemas.openxmlformats.org/officeDocument/2006/customXml" ds:itemID="{7A2F3CD1-13D0-4549-9551-5ABD98B23235}">
+<ds:datastoreItem xmlns:ds="http://schemas.openxmlformats.org/officeDocument/2006/customXml" ds:itemID="{B48A4633-8DFF-453B-BFEB-A847FB7DC26A}">
   <ds:schemaRefs>
     <ds:schemaRef ds:uri="http://schemas.openxmlformats.org/officeDocument/2006/bibliography"/>
   </ds:schemaRefs>

</xml_diff>